<commit_message>
Fill in student name and register number in project report
Co-Authored-By: Claude Opus 5.5 <noreply@anthropic.com>
Claude-Session: https://claude.ai/code/session_01G9XGwFqN3YSzbn3LuuXvVB
</commit_message>
<xml_diff>
--- a/docs/report/Wervexa_Project_Report.docx
+++ b/docs/report/Wervexa_Project_Report.docx
@@ -76,37 +76,8 @@
           <w:bCs/>
           <w:sz w:val="26"/>
           <w:szCs w:val="26"/>
-          <w:highlight w:val="yellow"/>
-        </w:rPr>
-        <w:t xml:space="preserve">STUDENT NAME</w:t>
-      </w:r>
-      <w:r>
-        <w:rPr>
-          <w:b/>
-          <w:bCs/>
-          <w:sz w:val="26"/>
-          <w:szCs w:val="26"/>
-        </w:rPr>
-        <w:t xml:space="preserve"> -   (</w:t>
-      </w:r>
-      <w:r>
-        <w:rPr>
-          <w:b/>
-          <w:bCs/>
-          <w:sz w:val="26"/>
-          <w:szCs w:val="26"/>
-          <w:highlight w:val="yellow"/>
-        </w:rPr>
-        <w:t xml:space="preserve">73152526XXX</w:t>
-      </w:r>
-      <w:r>
-        <w:rPr>
-          <w:b/>
-          <w:bCs/>
-          <w:sz w:val="26"/>
-          <w:szCs w:val="26"/>
-        </w:rPr>
-        <w:t xml:space="preserve">)</w:t>
+        </w:rPr>
+        <w:t xml:space="preserve">ROHITH S -   (73152526048)</w:t>
       </w:r>
     </w:p>
     <w:p>
@@ -517,31 +488,8 @@
         <w:rPr>
           <w:b/>
           <w:bCs/>
-          <w:highlight w:val="yellow"/>
-        </w:rPr>
-        <w:t xml:space="preserve">STUDENT NAME</w:t>
-      </w:r>
-      <w:r>
-        <w:rPr>
-          <w:b/>
-          <w:bCs/>
-        </w:rPr>
-        <w:t xml:space="preserve"> (</w:t>
-      </w:r>
-      <w:r>
-        <w:rPr>
-          <w:b/>
-          <w:bCs/>
-          <w:highlight w:val="yellow"/>
-        </w:rPr>
-        <w:t xml:space="preserve">73152526XXX</w:t>
-      </w:r>
-      <w:r>
-        <w:rPr>
-          <w:b/>
-          <w:bCs/>
-        </w:rPr>
-        <w:t xml:space="preserve">)</w:t>
+        </w:rPr>
+        <w:t xml:space="preserve">ROHITH S (73152526048)</w:t>
       </w:r>
       <w:r>
         <w:t xml:space="preserve"> who carried out the project work for Design Studio I under my supervision.</w:t>
@@ -956,31 +904,8 @@
         <w:rPr>
           <w:b/>
           <w:bCs/>
-          <w:highlight w:val="yellow"/>
-        </w:rPr>
-        <w:t xml:space="preserve">STUDENT NAME</w:t>
-      </w:r>
-      <w:r>
-        <w:rPr>
-          <w:b/>
-          <w:bCs/>
-        </w:rPr>
-        <w:t xml:space="preserve"> (</w:t>
-      </w:r>
-      <w:r>
-        <w:rPr>
-          <w:b/>
-          <w:bCs/>
-          <w:highlight w:val="yellow"/>
-        </w:rPr>
-        <w:t xml:space="preserve">73152526XXX</w:t>
-      </w:r>
-      <w:r>
-        <w:rPr>
-          <w:b/>
-          <w:bCs/>
-        </w:rPr>
-        <w:t xml:space="preserve">)</w:t>
+        </w:rPr>
+        <w:t xml:space="preserve">ROHITH S (73152526048)</w:t>
       </w:r>
     </w:p>
     <w:p>
@@ -1112,31 +1037,8 @@
         <w:rPr>
           <w:b/>
           <w:bCs/>
-          <w:highlight w:val="yellow"/>
-        </w:rPr>
-        <w:t xml:space="preserve">STUDENT NAME</w:t>
-      </w:r>
-      <w:r>
-        <w:rPr>
-          <w:b/>
-          <w:bCs/>
-        </w:rPr>
-        <w:t xml:space="preserve"> (</w:t>
-      </w:r>
-      <w:r>
-        <w:rPr>
-          <w:b/>
-          <w:bCs/>
-          <w:highlight w:val="yellow"/>
-        </w:rPr>
-        <w:t xml:space="preserve">73152526XXX</w:t>
-      </w:r>
-      <w:r>
-        <w:rPr>
-          <w:b/>
-          <w:bCs/>
-        </w:rPr>
-        <w:t xml:space="preserve">)</w:t>
+        </w:rPr>
+        <w:t xml:space="preserve">ROHITH S (73152526048)</w:t>
       </w:r>
     </w:p>
     <w:p/>

</xml_diff>

<commit_message>
Make project report open in Word 2007
The Word file now uses unique image ids, drops Word 2010+ attributes
and compatibility settings, and comes with a Word 97-2003 .doc copy.

Co-Authored-By: Claude Opus 5.5 <noreply@anthropic.com>
Claude-Session: https://claude.ai/code/session_01G9XGwFqN3YSzbn3LuuXvVB
</commit_message>
<xml_diff>
--- a/docs/report/Wervexa_Project_Report.docx
+++ b/docs/report/Wervexa_Project_Report.docx
@@ -204,7 +204,7 @@
                 <wp:inline distT="0" distB="0" distL="0" distR="0">
                   <wp:extent cx="1143000" cy="1019175"/>
                   <wp:effectExtent t="0" r="0" b="0" l="0"/>
-                  <wp:docPr id="1" name="" descr="" title=""/>
+                  <wp:docPr id="1" name="Picture 1"/>
                   <wp:cNvGraphicFramePr>
                     <a:graphicFrameLocks xmlns:a="http://schemas.openxmlformats.org/drawingml/2006/main" noChangeAspect="1"/>
                   </wp:cNvGraphicFramePr>
@@ -212,7 +212,7 @@
                     <a:graphicData uri="http://schemas.openxmlformats.org/drawingml/2006/picture">
                       <pic:pic xmlns:pic="http://schemas.openxmlformats.org/drawingml/2006/picture">
                         <pic:nvPicPr>
-                          <pic:cNvPr id="0" name="" descr=""/>
+                          <pic:cNvPr id="1" name="Picture 1"/>
                           <pic:cNvPicPr>
                             <a:picLocks noChangeAspect="1" noChangeArrowheads="1"/>
                           </pic:cNvPicPr>
@@ -330,7 +330,7 @@
                 <wp:inline distT="0" distB="0" distL="0" distR="0">
                   <wp:extent cx="1143000" cy="1085850"/>
                   <wp:effectExtent t="0" r="0" b="0" l="0"/>
-                  <wp:docPr id="1" name="" descr="" title=""/>
+                  <wp:docPr id="2" name="Picture 2"/>
                   <wp:cNvGraphicFramePr>
                     <a:graphicFrameLocks xmlns:a="http://schemas.openxmlformats.org/drawingml/2006/main" noChangeAspect="1"/>
                   </wp:cNvGraphicFramePr>
@@ -338,7 +338,7 @@
                     <a:graphicData uri="http://schemas.openxmlformats.org/drawingml/2006/picture">
                       <pic:pic xmlns:pic="http://schemas.openxmlformats.org/drawingml/2006/picture">
                         <pic:nvPicPr>
-                          <pic:cNvPr id="0" name="" descr=""/>
+                          <pic:cNvPr id="2" name="Picture 2"/>
                           <pic:cNvPicPr>
                             <a:picLocks noChangeAspect="1" noChangeArrowheads="1"/>
                           </pic:cNvPicPr>
@@ -7259,7 +7259,7 @@
           <wp:inline distT="0" distB="0" distL="0" distR="0">
             <wp:extent cx="5334000" cy="3914775"/>
             <wp:effectExtent t="0" r="0" b="0" l="0"/>
-            <wp:docPr id="1" name="" descr="" title=""/>
+            <wp:docPr id="3" name="Picture 3"/>
             <wp:cNvGraphicFramePr>
               <a:graphicFrameLocks xmlns:a="http://schemas.openxmlformats.org/drawingml/2006/main" noChangeAspect="1"/>
             </wp:cNvGraphicFramePr>
@@ -7267,7 +7267,7 @@
               <a:graphicData uri="http://schemas.openxmlformats.org/drawingml/2006/picture">
                 <pic:pic xmlns:pic="http://schemas.openxmlformats.org/drawingml/2006/picture">
                   <pic:nvPicPr>
-                    <pic:cNvPr id="0" name="" descr=""/>
+                    <pic:cNvPr id="3" name="Picture 3"/>
                     <pic:cNvPicPr>
                       <a:picLocks noChangeAspect="1" noChangeArrowheads="1"/>
                     </pic:cNvPicPr>
@@ -8040,7 +8040,7 @@
           <wp:inline distT="0" distB="0" distL="0" distR="0">
             <wp:extent cx="3143250" cy="5572125"/>
             <wp:effectExtent t="0" r="0" b="0" l="0"/>
-            <wp:docPr id="1" name="" descr="" title=""/>
+            <wp:docPr id="4" name="Picture 4"/>
             <wp:cNvGraphicFramePr>
               <a:graphicFrameLocks xmlns:a="http://schemas.openxmlformats.org/drawingml/2006/main" noChangeAspect="1"/>
             </wp:cNvGraphicFramePr>
@@ -8048,7 +8048,7 @@
               <a:graphicData uri="http://schemas.openxmlformats.org/drawingml/2006/picture">
                 <pic:pic xmlns:pic="http://schemas.openxmlformats.org/drawingml/2006/picture">
                   <pic:nvPicPr>
-                    <pic:cNvPr id="0" name="" descr=""/>
+                    <pic:cNvPr id="4" name="Picture 4"/>
                     <pic:cNvPicPr>
                       <a:picLocks noChangeAspect="1" noChangeArrowheads="1"/>
                     </pic:cNvPicPr>
@@ -11462,7 +11462,7 @@
           <wp:inline distT="0" distB="0" distL="0" distR="0">
             <wp:extent cx="5334000" cy="3000375"/>
             <wp:effectExtent t="0" r="0" b="0" l="0"/>
-            <wp:docPr id="1" name="" descr="" title=""/>
+            <wp:docPr id="5" name="Picture 5"/>
             <wp:cNvGraphicFramePr>
               <a:graphicFrameLocks xmlns:a="http://schemas.openxmlformats.org/drawingml/2006/main" noChangeAspect="1"/>
             </wp:cNvGraphicFramePr>
@@ -11470,7 +11470,7 @@
               <a:graphicData uri="http://schemas.openxmlformats.org/drawingml/2006/picture">
                 <pic:pic xmlns:pic="http://schemas.openxmlformats.org/drawingml/2006/picture">
                   <pic:nvPicPr>
-                    <pic:cNvPr id="0" name="" descr=""/>
+                    <pic:cNvPr id="5" name="Picture 5"/>
                     <pic:cNvPicPr>
                       <a:picLocks noChangeAspect="1" noChangeArrowheads="1"/>
                     </pic:cNvPicPr>
@@ -11524,7 +11524,7 @@
           <wp:inline distT="0" distB="0" distL="0" distR="0">
             <wp:extent cx="5334000" cy="3000375"/>
             <wp:effectExtent t="0" r="0" b="0" l="0"/>
-            <wp:docPr id="1" name="" descr="" title=""/>
+            <wp:docPr id="6" name="Picture 6"/>
             <wp:cNvGraphicFramePr>
               <a:graphicFrameLocks xmlns:a="http://schemas.openxmlformats.org/drawingml/2006/main" noChangeAspect="1"/>
             </wp:cNvGraphicFramePr>
@@ -11532,7 +11532,7 @@
               <a:graphicData uri="http://schemas.openxmlformats.org/drawingml/2006/picture">
                 <pic:pic xmlns:pic="http://schemas.openxmlformats.org/drawingml/2006/picture">
                   <pic:nvPicPr>
-                    <pic:cNvPr id="0" name="" descr=""/>
+                    <pic:cNvPr id="6" name="Picture 6"/>
                     <pic:cNvPicPr>
                       <a:picLocks noChangeAspect="1" noChangeArrowheads="1"/>
                     </pic:cNvPicPr>
@@ -11586,7 +11586,7 @@
           <wp:inline distT="0" distB="0" distL="0" distR="0">
             <wp:extent cx="5334000" cy="3000375"/>
             <wp:effectExtent t="0" r="0" b="0" l="0"/>
-            <wp:docPr id="1" name="" descr="" title=""/>
+            <wp:docPr id="7" name="Picture 7"/>
             <wp:cNvGraphicFramePr>
               <a:graphicFrameLocks xmlns:a="http://schemas.openxmlformats.org/drawingml/2006/main" noChangeAspect="1"/>
             </wp:cNvGraphicFramePr>
@@ -11594,7 +11594,7 @@
               <a:graphicData uri="http://schemas.openxmlformats.org/drawingml/2006/picture">
                 <pic:pic xmlns:pic="http://schemas.openxmlformats.org/drawingml/2006/picture">
                   <pic:nvPicPr>
-                    <pic:cNvPr id="0" name="" descr=""/>
+                    <pic:cNvPr id="7" name="Picture 7"/>
                     <pic:cNvPicPr>
                       <a:picLocks noChangeAspect="1" noChangeArrowheads="1"/>
                     </pic:cNvPicPr>
@@ -11698,7 +11698,7 @@
                 <wp:inline distT="0" distB="0" distL="0" distR="0">
                   <wp:extent cx="1619250" cy="3619500"/>
                   <wp:effectExtent t="0" r="0" b="0" l="0"/>
-                  <wp:docPr id="1" name="" descr="" title=""/>
+                  <wp:docPr id="8" name="Picture 8"/>
                   <wp:cNvGraphicFramePr>
                     <a:graphicFrameLocks xmlns:a="http://schemas.openxmlformats.org/drawingml/2006/main" noChangeAspect="1"/>
                   </wp:cNvGraphicFramePr>
@@ -11706,7 +11706,7 @@
                     <a:graphicData uri="http://schemas.openxmlformats.org/drawingml/2006/picture">
                       <pic:pic xmlns:pic="http://schemas.openxmlformats.org/drawingml/2006/picture">
                         <pic:nvPicPr>
-                          <pic:cNvPr id="0" name="" descr=""/>
+                          <pic:cNvPr id="8" name="Picture 8"/>
                           <pic:cNvPicPr>
                             <a:picLocks noChangeAspect="1" noChangeArrowheads="1"/>
                           </pic:cNvPicPr>
@@ -11761,7 +11761,7 @@
                 <wp:inline distT="0" distB="0" distL="0" distR="0">
                   <wp:extent cx="1619250" cy="3619500"/>
                   <wp:effectExtent t="0" r="0" b="0" l="0"/>
-                  <wp:docPr id="1" name="" descr="" title=""/>
+                  <wp:docPr id="9" name="Picture 9"/>
                   <wp:cNvGraphicFramePr>
                     <a:graphicFrameLocks xmlns:a="http://schemas.openxmlformats.org/drawingml/2006/main" noChangeAspect="1"/>
                   </wp:cNvGraphicFramePr>
@@ -11769,7 +11769,7 @@
                     <a:graphicData uri="http://schemas.openxmlformats.org/drawingml/2006/picture">
                       <pic:pic xmlns:pic="http://schemas.openxmlformats.org/drawingml/2006/picture">
                         <pic:nvPicPr>
-                          <pic:cNvPr id="0" name="" descr=""/>
+                          <pic:cNvPr id="9" name="Picture 9"/>
                           <pic:cNvPicPr>
                             <a:picLocks noChangeAspect="1" noChangeArrowheads="1"/>
                           </pic:cNvPicPr>
@@ -11824,7 +11824,7 @@
                 <wp:inline distT="0" distB="0" distL="0" distR="0">
                   <wp:extent cx="1619250" cy="3619500"/>
                   <wp:effectExtent t="0" r="0" b="0" l="0"/>
-                  <wp:docPr id="1" name="" descr="" title=""/>
+                  <wp:docPr id="10" name="Picture 10"/>
                   <wp:cNvGraphicFramePr>
                     <a:graphicFrameLocks xmlns:a="http://schemas.openxmlformats.org/drawingml/2006/main" noChangeAspect="1"/>
                   </wp:cNvGraphicFramePr>
@@ -11832,7 +11832,7 @@
                     <a:graphicData uri="http://schemas.openxmlformats.org/drawingml/2006/picture">
                       <pic:pic xmlns:pic="http://schemas.openxmlformats.org/drawingml/2006/picture">
                         <pic:nvPicPr>
-                          <pic:cNvPr id="0" name="" descr=""/>
+                          <pic:cNvPr id="10" name="Picture 10"/>
                           <pic:cNvPicPr>
                             <a:picLocks noChangeAspect="1" noChangeArrowheads="1"/>
                           </pic:cNvPicPr>
@@ -13241,9 +13241,9 @@
 
 <file path=word/numbering.xml><?xml version="1.0" encoding="utf-8"?>
 <w:numbering xmlns:wpc="http://schemas.microsoft.com/office/word/2010/wordprocessingCanvas" xmlns:mc="http://schemas.openxmlformats.org/markup-compatibility/2006" xmlns:o="urn:schemas-microsoft-com:office:office" xmlns:r="http://schemas.openxmlformats.org/officeDocument/2006/relationships" xmlns:m="http://schemas.openxmlformats.org/officeDocument/2006/math" xmlns:v="urn:schemas-microsoft-com:vml" xmlns:wp14="http://schemas.microsoft.com/office/word/2010/wordprocessingDrawing" xmlns:wp="http://schemas.openxmlformats.org/drawingml/2006/wordprocessingDrawing" xmlns:w10="urn:schemas-microsoft-com:office:word" xmlns:w="http://schemas.openxmlformats.org/wordprocessingml/2006/main" xmlns:w14="http://schemas.microsoft.com/office/word/2010/wordml" xmlns:w15="http://schemas.microsoft.com/office/word/2012/wordml" xmlns:wpg="http://schemas.microsoft.com/office/word/2010/wordprocessingGroup" xmlns:wpi="http://schemas.microsoft.com/office/word/2010/wordprocessingInk" xmlns:wne="http://schemas.microsoft.com/office/word/2006/wordml" xmlns:wps="http://schemas.microsoft.com/office/word/2010/wordprocessingShape" mc:Ignorable="w14 w15 wp14">
-  <w:abstractNum w:abstractNumId="1" w15:restartNumberingAfterBreak="0">
+  <w:abstractNum w:abstractNumId="1">
     <w:multiLevelType w:val="hybridMultilevel"/>
-    <w:lvl w:ilvl="0" w15:tentative="1">
+    <w:lvl w:ilvl="0">
       <w:start w:val="1"/>
       <w:numFmt w:val="bullet"/>
       <w:lvlText w:val="●"/>
@@ -13252,7 +13252,7 @@
         <w:ind w:left="720" w:hanging="360"/>
       </w:pPr>
     </w:lvl>
-    <w:lvl w:ilvl="1" w15:tentative="1">
+    <w:lvl w:ilvl="1">
       <w:start w:val="1"/>
       <w:numFmt w:val="bullet"/>
       <w:lvlText w:val="○"/>
@@ -13261,7 +13261,7 @@
         <w:ind w:left="1440" w:hanging="360"/>
       </w:pPr>
     </w:lvl>
-    <w:lvl w:ilvl="2" w15:tentative="1">
+    <w:lvl w:ilvl="2">
       <w:start w:val="1"/>
       <w:numFmt w:val="bullet"/>
       <w:lvlText w:val="■"/>
@@ -13270,7 +13270,7 @@
         <w:ind w:left="2160" w:hanging="360"/>
       </w:pPr>
     </w:lvl>
-    <w:lvl w:ilvl="3" w15:tentative="1">
+    <w:lvl w:ilvl="3">
       <w:start w:val="1"/>
       <w:numFmt w:val="bullet"/>
       <w:lvlText w:val="●"/>
@@ -13279,7 +13279,7 @@
         <w:ind w:left="2880" w:hanging="360"/>
       </w:pPr>
     </w:lvl>
-    <w:lvl w:ilvl="4" w15:tentative="1">
+    <w:lvl w:ilvl="4">
       <w:start w:val="1"/>
       <w:numFmt w:val="bullet"/>
       <w:lvlText w:val="○"/>
@@ -13288,7 +13288,7 @@
         <w:ind w:left="3600" w:hanging="360"/>
       </w:pPr>
     </w:lvl>
-    <w:lvl w:ilvl="5" w15:tentative="1">
+    <w:lvl w:ilvl="5">
       <w:start w:val="1"/>
       <w:numFmt w:val="bullet"/>
       <w:lvlText w:val="■"/>
@@ -13297,7 +13297,7 @@
         <w:ind w:left="4320" w:hanging="360"/>
       </w:pPr>
     </w:lvl>
-    <w:lvl w:ilvl="6" w15:tentative="1">
+    <w:lvl w:ilvl="6">
       <w:start w:val="1"/>
       <w:numFmt w:val="bullet"/>
       <w:lvlText w:val="●"/>
@@ -13306,7 +13306,7 @@
         <w:ind w:left="5040" w:hanging="360"/>
       </w:pPr>
     </w:lvl>
-    <w:lvl w:ilvl="7" w15:tentative="1">
+    <w:lvl w:ilvl="7">
       <w:start w:val="1"/>
       <w:numFmt w:val="bullet"/>
       <w:lvlText w:val="●"/>
@@ -13315,7 +13315,7 @@
         <w:ind w:left="5760" w:hanging="360"/>
       </w:pPr>
     </w:lvl>
-    <w:lvl w:ilvl="8" w15:tentative="1">
+    <w:lvl w:ilvl="8">
       <w:start w:val="1"/>
       <w:numFmt w:val="bullet"/>
       <w:lvlText w:val="●"/>
@@ -13325,9 +13325,9 @@
       </w:pPr>
     </w:lvl>
   </w:abstractNum>
-  <w:abstractNum w:abstractNumId="2" w15:restartNumberingAfterBreak="0">
+  <w:abstractNum w:abstractNumId="2">
     <w:multiLevelType w:val="hybridMultilevel"/>
-    <w:lvl w:ilvl="0" w15:tentative="1">
+    <w:lvl w:ilvl="0">
       <w:start w:val="1"/>
       <w:numFmt w:val="bullet"/>
       <w:lvlText w:val="•"/>
@@ -13336,7 +13336,7 @@
         <w:ind w:left="720" w:hanging="360"/>
       </w:pPr>
     </w:lvl>
-    <w:lvl w:ilvl="1" w15:tentative="1">
+    <w:lvl w:ilvl="1">
       <w:start w:val="1"/>
       <w:numFmt w:val="bullet"/>
       <w:lvlText w:val="o"/>
@@ -13346,9 +13346,9 @@
       </w:pPr>
     </w:lvl>
   </w:abstractNum>
-  <w:abstractNum w:abstractNumId="3" w15:restartNumberingAfterBreak="0">
+  <w:abstractNum w:abstractNumId="3">
     <w:multiLevelType w:val="hybridMultilevel"/>
-    <w:lvl w:ilvl="0" w15:tentative="1">
+    <w:lvl w:ilvl="0">
       <w:start w:val="1"/>
       <w:numFmt w:val="decimal"/>
       <w:lvlText w:val="%1."/>

</xml_diff>